<commit_message>
content: tornar abstrato o item de software com IA (remove o Beaver)
Item deixa de citar ferramenta especifica; passa a descrever o que
caracteriza uma boa aplicacao de IA no fluxo de pesquisa e os
criterios para avaliar uma ferramenta antes de adotar.

Co-Authored-By: Claude Sonnet 5 <noreply@anthropic.com>
</commit_message>
<xml_diff>
--- a/docs/2026-workshop-agentes-dcp-usp-ementa.docx
+++ b/docs/2026-workshop-agentes-dcp-usp-ementa.docx
@@ -311,13 +311,13 @@
           <w:b/>
           <w:bCs/>
         </w:rPr>
-        <w:t xml:space="preserve">Integrar</w:t>
+        <w:t xml:space="preserve">Avaliar</w:t>
       </w:r>
       <w:r>
         <w:t xml:space="preserve"> </w:t>
       </w:r>
       <w:r>
-        <w:t xml:space="preserve">ao fluxo de pesquisa uma ferramenta de IA já existente, como o Beaver no Zotero.</w:t>
+        <w:t xml:space="preserve">e integrar ao fluxo de pesquisa uma ferramenta de IA já existente, com critério.</w:t>
       </w:r>
     </w:p>
     <w:p>
@@ -431,7 +431,7 @@
       </w:r>
     </w:p>
     <w:bookmarkEnd w:id="11"/>
-    <w:bookmarkStart w:id="15" w:name="programa-do-curso"/>
+    <w:bookmarkStart w:id="14" w:name="programa-do-curso"/>
     <w:p>
       <w:pPr>
         <w:pStyle w:val="Heading1"/>
@@ -625,7 +625,7 @@
       </w:r>
     </w:p>
     <w:bookmarkEnd w:id="12"/>
-    <w:bookmarkStart w:id="14" w:name="sessão-2-habilidades-práticas-1h30"/>
+    <w:bookmarkStart w:id="13" w:name="sessão-2-habilidades-práticas-1h30"/>
     <w:p>
       <w:pPr>
         <w:pStyle w:val="Heading2"/>
@@ -858,7 +858,7 @@
           <w:b/>
           <w:bCs/>
         </w:rPr>
-        <w:t xml:space="preserve">Software com IA para Pesquisa — Casos Exemplares</w:t>
+        <w:t xml:space="preserve">Software com IA para Pesquisa — Boas Aplicações Exemplares</w:t>
       </w:r>
     </w:p>
     <w:p>
@@ -869,16 +869,8 @@
           <w:numId w:val="1011"/>
         </w:numPr>
       </w:pPr>
-      <w:hyperlink r:id="rId13">
-        <w:r>
-          <w:rPr>
-            <w:rStyle w:val="Hyperlink"/>
-          </w:rPr>
-          <w:t xml:space="preserve">Beaver</w:t>
-        </w:r>
-      </w:hyperlink>
-      <w:r>
-        <w:t xml:space="preserve">: assistente de IA para Zotero que responde perguntas sobre a biblioteca de referências com citação rastreável sentença a sentença.</w:t>
+      <w:r>
+        <w:t xml:space="preserve">O que caracteriza uma boa aplicação de IA no fluxo de pesquisa: respostas rastreáveis até a fonte, integração com as ferramentas que o pesquisador já usa, e transparência sobre o que foi automatizado.</w:t>
       </w:r>
     </w:p>
     <w:p>
@@ -890,23 +882,11 @@
         </w:numPr>
       </w:pPr>
       <w:r>
-        <w:t xml:space="preserve">Outras ferramentas: recursos de codificação qualitativa assistida por IA em NVivo/ATLAS.ti.</w:t>
-      </w:r>
-    </w:p>
-    <w:p>
-      <w:pPr>
-        <w:pStyle w:val="Compact"/>
-        <w:numPr>
-          <w:ilvl w:val="1"/>
-          <w:numId w:val="1011"/>
-        </w:numPr>
-      </w:pPr>
-      <w:r>
-        <w:t xml:space="preserve">Critérios para avaliar uma ferramenta antes de adotar no fluxo de pesquisa: rastreabilidade da citação, portabilidade dos dados, custo e maturidade do projeto.</w:t>
-      </w:r>
-    </w:p>
+        <w:t xml:space="preserve">Critérios para avaliar uma ferramenta antes de adotar: rastreabilidade da citação, portabilidade dos dados, custo e maturidade do projeto.</w:t>
+      </w:r>
+    </w:p>
+    <w:bookmarkEnd w:id="13"/>
     <w:bookmarkEnd w:id="14"/>
-    <w:bookmarkEnd w:id="15"/>
     <w:sectPr>
       <w:footnotePr>
         <w:numRestart w:val="eachSect"/>

</xml_diff>

<commit_message>
content: explicitar por que a ementa evita citar produtos especificos
Adiciona ao item de software com IA a justificativa de nao nomear
marca: o mercado muda rapido e produtos sao superados por
concorrentes/novas versoes, entao o foco fica no criterio de
avaliacao.

Co-Authored-By: Claude Sonnet 5 <noreply@anthropic.com>
</commit_message>
<xml_diff>
--- a/docs/2026-workshop-agentes-dcp-usp-ementa.docx
+++ b/docs/2026-workshop-agentes-dcp-usp-ementa.docx
@@ -871,6 +871,18 @@
       </w:pPr>
       <w:r>
         <w:t xml:space="preserve">O que caracteriza uma boa aplicação de IA no fluxo de pesquisa: respostas rastreáveis até a fonte, integração com as ferramentas que o pesquisador já usa, e transparência sobre o que foi automatizado.</w:t>
+      </w:r>
+    </w:p>
+    <w:p>
+      <w:pPr>
+        <w:pStyle w:val="Compact"/>
+        <w:numPr>
+          <w:ilvl w:val="1"/>
+          <w:numId w:val="1011"/>
+        </w:numPr>
+      </w:pPr>
+      <w:r>
+        <w:t xml:space="preserve">Categorias com boas alternativas de IA hoje (gestão de referências, transcrição, análise qualitativa): o mercado muda rápido e produtos específicos são superados por concorrentes ou novas versões — por isso o foco é no critério de avaliação, não em uma marca.</w:t>
       </w:r>
     </w:p>
     <w:p>

</xml_diff>

<commit_message>
docs(ementa): incorporar feedback de Galdino e Lamarca na Sessao 2
- Hooks: deixar claro que a analogia com git hooks e conceitual, sem
  exigir conhecimento previo de git dos participantes (nao ha tempo
  para ensinar git nas 3h de carga horaria).
- Skills e Aplicacoes Exemplares: adicionar gerenciamento de contexto
  (separar agente de implementacao de agente de validacao).
- README: tabela da Sessao 2 atualizada; PDF/DOCX recompilados.
</commit_message>
<xml_diff>
--- a/docs/2026-workshop-agentes-dcp-usp-ementa.docx
+++ b/docs/2026-workshop-agentes-dcp-usp-ementa.docx
@@ -70,15 +70,7 @@
         <w:pStyle w:val="FirstParagraph"/>
       </w:pPr>
       <w:r>
-        <w:t xml:space="preserve">Os Modelos de Linguagem de Grande Porte (LLMs) inauguraram uma transição: dos chatbots para agentes de IA, sistemas capazes de executar comandos, não apenas responder. Na pesquisa acadêmica — não só em ciências sociais — isso significa executar planos com várias etapas, manipular dados empíricos, usar ferramentas externas (editar e ler arquivos, chamar APIs, pesquisar na internet) e testar os resultados das próprias tarefas.</w:t>
-      </w:r>
-    </w:p>
-    <w:p>
-      <w:pPr>
-        <w:pStyle w:val="BodyText"/>
-      </w:pPr>
-      <w:r>
-        <w:t xml:space="preserve">Isso já é útil para diversas tarefas que antes tomavam muito tempo e agora saem com custo bem mais baixo: análise exploratória de dados, transcrição de entrevistas, organização e triagem de arquivos extensos, classificação de notícias e outros documentos, e criação de bases de dados, entre outras.</w:t>
+        <w:t xml:space="preserve">No último ano, o uso mais interessante dos modelos de linguagem (LLMs) transicionou dos chatbots para agentes: os modelos ganharam a capacidade de executar comandos no computador, consultar arquivos e encontrar informações autonomamente. Na pesquisa acadêmica, isso significa executar planos com várias etapas, manipular dados empíricos, usar ferramentas externas (editar e ler arquivos, chamar APIs, pesquisar na internet) e testar os resultados das próprias tarefas. Isso já é útil para diversas tarefas que antes tomavam muito tempo e agora saem com custo bem mais baixo: análise exploratória de dados, transcrição de entrevistas, organização e triagem de arquivos extensos, classificação de notícias e outros documentos, e criação de bases de dados, entre outras.</w:t>
       </w:r>
     </w:p>
     <w:p>
@@ -112,7 +104,7 @@
         <w:t xml:space="preserve">code as policy</w:t>
       </w:r>
       <w:r>
-        <w:t xml:space="preserve">: regras rígidas sobre o que um agente pode e não pode fazer, para evitar caos e catástrofe na pesquisa com agentes.</w:t>
+        <w:t xml:space="preserve">: regras rígidas sobre o que um agente pode e não pode fazer, para evitar problemas de reprodutibilidade e rigor na pesquisa com agentes.</w:t>
       </w:r>
     </w:p>
     <w:p>
@@ -159,7 +151,7 @@
         <w:t xml:space="preserve"> </w:t>
       </w:r>
       <w:r>
-        <w:t xml:space="preserve">tarefas de pesquisa que já dá para automatizar com um agente hoje — transcrição, classificação de documentos, organização de arquivos extensos, análise exploratória de dados.</w:t>
+        <w:t xml:space="preserve">tarefas de pesquisa em que a automação com agentes é vantajosa — transcrição, classificação de documentos, organização de arquivos extensos, análise exploratória de dados.</w:t>
       </w:r>
     </w:p>
     <w:p>
@@ -213,7 +205,7 @@
           <w:b/>
           <w:bCs/>
         </w:rPr>
-        <w:t xml:space="preserve">Decidir</w:t>
+        <w:t xml:space="preserve">Identificar</w:t>
       </w:r>
       <w:r>
         <w:t xml:space="preserve"> </w:t>
@@ -317,7 +309,7 @@
         <w:t xml:space="preserve"> </w:t>
       </w:r>
       <w:r>
-        <w:t xml:space="preserve">e integrar ao fluxo de pesquisa uma ferramenta de IA já existente, com critério.</w:t>
+        <w:t xml:space="preserve">e integrar ao fluxo de pesquisa uma ferramenta de IA já existente.</w:t>
       </w:r>
     </w:p>
     <w:p>
@@ -410,17 +402,7 @@
         <w:t xml:space="preserve">Formato</w:t>
       </w:r>
       <w:r>
-        <w:t xml:space="preserve">: Aulas expositivas e demonstrações ao vivo (</w:t>
-      </w:r>
-      <w:r>
-        <w:rPr>
-          <w:i/>
-          <w:iCs/>
-        </w:rPr>
-        <w:t xml:space="preserve">live coding/tooling</w:t>
-      </w:r>
-      <w:r>
-        <w:t xml:space="preserve">).</w:t>
+        <w:t xml:space="preserve">: Aulas expositivas e demonstrações ao vivo.</w:t>
       </w:r>
     </w:p>
     <w:p>
@@ -440,13 +422,13 @@
         <w:t xml:space="preserve">4. Programa do Curso</w:t>
       </w:r>
     </w:p>
-    <w:bookmarkStart w:id="12" w:name="sessão-1-do-chatbot-ao-agente-1h30"/>
+    <w:bookmarkStart w:id="12" w:name="sessão-1-introdução-aos-agentes-1h30"/>
     <w:p>
       <w:pPr>
         <w:pStyle w:val="Heading2"/>
       </w:pPr>
       <w:r>
-        <w:t xml:space="preserve">Sessão 1: Do Chatbot ao Agente (1h30)</w:t>
+        <w:t xml:space="preserve">Sessão 1: Introdução aos Agentes (1h30)</w:t>
       </w:r>
     </w:p>
     <w:p>
@@ -474,7 +456,7 @@
           <w:b/>
           <w:bCs/>
         </w:rPr>
-        <w:t xml:space="preserve">Do Chatbot ao Agente</w:t>
+        <w:t xml:space="preserve">LLMs como Agentes</w:t>
       </w:r>
     </w:p>
     <w:p>
@@ -502,7 +484,7 @@
           <w:b/>
           <w:bCs/>
         </w:rPr>
-        <w:t xml:space="preserve">Prosa vs. Instruções Determinísticas</w:t>
+        <w:t xml:space="preserve">Panorama de Modelos e Ferramentas</w:t>
       </w:r>
     </w:p>
     <w:p>
@@ -514,7 +496,7 @@
         </w:numPr>
       </w:pPr>
       <w:r>
-        <w:t xml:space="preserve">Quando confiar no julgamento do modelo (instrução em prosa) e quando impor uma regra fixa que executa sempre da mesma forma.</w:t>
+        <w:t xml:space="preserve">Principais famílias de modelos hoje (Claude, GPT, Gemini, DeepSeek, modelos abertos) e o que muda entre elas na prática de pesquisa.</w:t>
       </w:r>
     </w:p>
     <w:p>
@@ -526,7 +508,23 @@
         </w:numPr>
       </w:pPr>
       <w:r>
-        <w:t xml:space="preserve">Por que a pesquisa empírica exige, em certos pontos do processo, uma previsibilidade que só regras determinísticas garantem.</w:t>
+        <w:t xml:space="preserve">Agentes de terminal e de editor (Open Code, Claude Code, entre outros): o que são e como se diferenciam de um chatbot comum.</w:t>
+      </w:r>
+    </w:p>
+    <w:p>
+      <w:pPr>
+        <w:pStyle w:val="Compact"/>
+        <w:numPr>
+          <w:ilvl w:val="0"/>
+          <w:numId w:val="1003"/>
+        </w:numPr>
+      </w:pPr>
+      <w:r>
+        <w:rPr>
+          <w:b/>
+          <w:bCs/>
+        </w:rPr>
+        <w:t xml:space="preserve">Benefícios, Vantagens e Custos</w:t>
       </w:r>
     </w:p>
     <w:p>
@@ -534,27 +532,122 @@
         <w:pStyle w:val="Compact"/>
         <w:numPr>
           <w:ilvl w:val="1"/>
-          <w:numId w:val="1005"/>
-        </w:numPr>
-      </w:pPr>
-      <w:r>
-        <w:t xml:space="preserve">Gancho para a Sessão 2: essa distinção é a base de</w:t>
-      </w:r>
-      <w:r>
-        <w:t xml:space="preserve"> </w:t>
-      </w:r>
+          <w:numId w:val="1006"/>
+        </w:numPr>
+      </w:pPr>
+      <w:r>
+        <w:t xml:space="preserve">Que tarefas de pesquisa se beneficiam de automação com agentes — e quais não valem o esforço de configurar um agente.</w:t>
+      </w:r>
+    </w:p>
+    <w:p>
+      <w:pPr>
+        <w:pStyle w:val="Compact"/>
+        <w:numPr>
+          <w:ilvl w:val="1"/>
+          <w:numId w:val="1006"/>
+        </w:numPr>
+      </w:pPr>
+      <w:r>
+        <w:t xml:space="preserve">Modelos de cobrança: assinatura de aplicativo vs. cobrança por uso de API (tokens); ordem de grandeza de custo para tarefas típicas de pesquisa.</w:t>
+      </w:r>
+    </w:p>
+    <w:p>
+      <w:pPr>
+        <w:pStyle w:val="Compact"/>
+        <w:numPr>
+          <w:ilvl w:val="0"/>
+          <w:numId w:val="1003"/>
+        </w:numPr>
+      </w:pPr>
+      <w:r>
+        <w:rPr>
+          <w:b/>
+          <w:bCs/>
+        </w:rPr>
+        <w:t xml:space="preserve">O Harness do Agente: Isolamento e Containerização</w:t>
+      </w:r>
+    </w:p>
+    <w:p>
+      <w:pPr>
+        <w:pStyle w:val="Compact"/>
+        <w:numPr>
+          <w:ilvl w:val="1"/>
+          <w:numId w:val="1007"/>
+        </w:numPr>
+      </w:pPr>
       <w:r>
         <w:rPr>
           <w:i/>
           <w:iCs/>
         </w:rPr>
-        <w:t xml:space="preserve">hooks</w:t>
-      </w:r>
-      <w:r>
-        <w:t xml:space="preserve"> </w:t>
-      </w:r>
-      <w:r>
-        <w:t xml:space="preserve">e</w:t>
+        <w:t xml:space="preserve">Harness</w:t>
+      </w:r>
+      <w:r>
+        <w:t xml:space="preserve">: o ambiente que envolve o modelo e viabiliza sua execução — quem controla permissões de leitura/escrita, o que o agente pode acessar, quem decide quando parar.</w:t>
+      </w:r>
+    </w:p>
+    <w:p>
+      <w:pPr>
+        <w:pStyle w:val="Compact"/>
+        <w:numPr>
+          <w:ilvl w:val="1"/>
+          <w:numId w:val="1007"/>
+        </w:numPr>
+      </w:pPr>
+      <w:r>
+        <w:t xml:space="preserve">Containerização: rodar agentes em sandbox/container limita o raio de dano de uma ação indevida.</w:t>
+      </w:r>
+    </w:p>
+    <w:p>
+      <w:pPr>
+        <w:pStyle w:val="Compact"/>
+        <w:numPr>
+          <w:ilvl w:val="0"/>
+          <w:numId w:val="1003"/>
+        </w:numPr>
+      </w:pPr>
+      <w:r>
+        <w:rPr>
+          <w:b/>
+          <w:bCs/>
+        </w:rPr>
+        <w:t xml:space="preserve">Instrução em Prosa vs. Restrições Determinísticas</w:t>
+      </w:r>
+    </w:p>
+    <w:p>
+      <w:pPr>
+        <w:pStyle w:val="Compact"/>
+        <w:numPr>
+          <w:ilvl w:val="1"/>
+          <w:numId w:val="1008"/>
+        </w:numPr>
+      </w:pPr>
+      <w:r>
+        <w:t xml:space="preserve">Quando confiar no julgamento do modelo (instrução em prosa) e quando impor uma regra fixa que executa sempre da mesma forma.</w:t>
+      </w:r>
+    </w:p>
+    <w:p>
+      <w:pPr>
+        <w:pStyle w:val="Compact"/>
+        <w:numPr>
+          <w:ilvl w:val="1"/>
+          <w:numId w:val="1008"/>
+        </w:numPr>
+      </w:pPr>
+      <w:r>
+        <w:t xml:space="preserve">Por que a pesquisa empírica exige, em certos pontos do processo, uma previsibilidade que demanda regras determinísticas.</w:t>
+      </w:r>
+    </w:p>
+    <w:p>
+      <w:pPr>
+        <w:pStyle w:val="Compact"/>
+        <w:numPr>
+          <w:ilvl w:val="1"/>
+          <w:numId w:val="1008"/>
+        </w:numPr>
+      </w:pPr>
+      <w:r>
+        <w:t xml:space="preserve">Gancho para a Sessão 2: essa distinção é a base de</w:t>
       </w:r>
       <w:r>
         <w:t xml:space="preserve"> </w:t>
@@ -564,57 +657,26 @@
           <w:i/>
           <w:iCs/>
         </w:rPr>
-        <w:t xml:space="preserve">code as policy</w:t>
-      </w:r>
-      <w:r>
-        <w:t xml:space="preserve">.</w:t>
-      </w:r>
-    </w:p>
-    <w:p>
-      <w:pPr>
-        <w:pStyle w:val="Compact"/>
-        <w:numPr>
-          <w:ilvl w:val="0"/>
-          <w:numId w:val="1003"/>
-        </w:numPr>
-      </w:pPr>
-      <w:r>
-        <w:rPr>
-          <w:b/>
-          <w:bCs/>
-        </w:rPr>
-        <w:t xml:space="preserve">O Harness do Agente: Isolamento e Containerização</w:t>
-      </w:r>
-    </w:p>
-    <w:p>
-      <w:pPr>
-        <w:pStyle w:val="Compact"/>
-        <w:numPr>
-          <w:ilvl w:val="1"/>
-          <w:numId w:val="1006"/>
-        </w:numPr>
-      </w:pPr>
+        <w:t xml:space="preserve">hooks</w:t>
+      </w:r>
+      <w:r>
+        <w:t xml:space="preserve"> </w:t>
+      </w:r>
+      <w:r>
+        <w:t xml:space="preserve">e</w:t>
+      </w:r>
+      <w:r>
+        <w:t xml:space="preserve"> </w:t>
+      </w:r>
       <w:r>
         <w:rPr>
           <w:i/>
           <w:iCs/>
         </w:rPr>
-        <w:t xml:space="preserve">Harness</w:t>
-      </w:r>
-      <w:r>
-        <w:t xml:space="preserve">: o ambiente que envolve o modelo e viabiliza sua execução — quem controla permissões de leitura/escrita, o que o agente pode acessar, quem decide quando parar.</w:t>
-      </w:r>
-    </w:p>
-    <w:p>
-      <w:pPr>
-        <w:pStyle w:val="Compact"/>
-        <w:numPr>
-          <w:ilvl w:val="1"/>
-          <w:numId w:val="1006"/>
-        </w:numPr>
-      </w:pPr>
-      <w:r>
-        <w:t xml:space="preserve">Containerização como mecanismo prático de isolamento: por que rodar um agente em sandbox/container limita o raio de dano de uma ação indevida.</w:t>
+        <w:t xml:space="preserve">code as policy</w:t>
+      </w:r>
+      <w:r>
+        <w:t xml:space="preserve">.</w:t>
       </w:r>
     </w:p>
     <w:p>
@@ -625,13 +687,13 @@
       </w:r>
     </w:p>
     <w:bookmarkEnd w:id="12"/>
-    <w:bookmarkStart w:id="13" w:name="sessão-2-habilidades-práticas-1h30"/>
+    <w:bookmarkStart w:id="13" w:name="X3d34b34c4e4e76305d74696d5818e1a712e93ae"/>
     <w:p>
       <w:pPr>
         <w:pStyle w:val="Heading2"/>
       </w:pPr>
       <w:r>
-        <w:t xml:space="preserve">Sessão 2: Habilidades Práticas (1h30)</w:t>
+        <w:t xml:space="preserve">Sessão 2: Habilidades Práticas e Governança (1h30)</w:t>
       </w:r>
     </w:p>
     <w:p>
@@ -651,7 +713,7 @@
         <w:pStyle w:val="Compact"/>
         <w:numPr>
           <w:ilvl w:val="0"/>
-          <w:numId w:val="1007"/>
+          <w:numId w:val="1009"/>
         </w:numPr>
       </w:pPr>
       <w:r>
@@ -659,7 +721,7 @@
           <w:b/>
           <w:bCs/>
         </w:rPr>
-        <w:t xml:space="preserve">Git Hooks → Hooks de Agente</w:t>
+        <w:t xml:space="preserve">Skills: Instruções Reutilizáveis</w:t>
       </w:r>
     </w:p>
     <w:p>
@@ -667,21 +729,24 @@
         <w:pStyle w:val="Compact"/>
         <w:numPr>
           <w:ilvl w:val="1"/>
-          <w:numId w:val="1008"/>
-        </w:numPr>
-      </w:pPr>
+          <w:numId w:val="1010"/>
+        </w:numPr>
+      </w:pPr>
+      <w:r>
+        <w:t xml:space="preserve">O que são</w:t>
+      </w:r>
+      <w:r>
+        <w:t xml:space="preserve"> </w:t>
+      </w:r>
       <w:r>
         <w:rPr>
           <w:i/>
           <w:iCs/>
         </w:rPr>
-        <w:t xml:space="preserve">Git hooks</w:t>
-      </w:r>
-      <w:r>
-        <w:t xml:space="preserve"> </w:t>
-      </w:r>
-      <w:r>
-        <w:t xml:space="preserve">como ponto de partida familiar: scripts que disparam automaticamente em pontos fixos do fluxo de trabalho (commit, push).</w:t>
+        <w:t xml:space="preserve">skills</w:t>
+      </w:r>
+      <w:r>
+        <w:t xml:space="preserve">: instruções empacotadas e reutilizáveis para tarefas de pesquisa recorrentes.</w:t>
       </w:r>
     </w:p>
     <w:p>
@@ -689,7 +754,35 @@
         <w:pStyle w:val="Compact"/>
         <w:numPr>
           <w:ilvl w:val="1"/>
-          <w:numId w:val="1008"/>
+          <w:numId w:val="1010"/>
+        </w:numPr>
+      </w:pPr>
+      <w:r>
+        <w:t xml:space="preserve">Para quem quiser ir além: orquestração de múltiplos agentes trabalhando em conjunto numa mesma tarefa — por exemplo, separar um agente que implementa de outro que só valida o que foi feito, mantendo o contexto de cada etapa enxuto e a revisão independente da execução.</w:t>
+      </w:r>
+    </w:p>
+    <w:p>
+      <w:pPr>
+        <w:pStyle w:val="Compact"/>
+        <w:numPr>
+          <w:ilvl w:val="0"/>
+          <w:numId w:val="1009"/>
+        </w:numPr>
+      </w:pPr>
+      <w:r>
+        <w:rPr>
+          <w:b/>
+          <w:bCs/>
+        </w:rPr>
+        <w:t xml:space="preserve">Controle Determinístico com Hooks</w:t>
+      </w:r>
+    </w:p>
+    <w:p>
+      <w:pPr>
+        <w:pStyle w:val="Compact"/>
+        <w:numPr>
+          <w:ilvl w:val="1"/>
+          <w:numId w:val="1011"/>
         </w:numPr>
       </w:pPr>
       <w:r>
@@ -703,38 +796,61 @@
         <w:t xml:space="preserve"> </w:t>
       </w:r>
       <w:r>
-        <w:t xml:space="preserve">de agente como a mesma ideia aplicada à execução do modelo: validações e bloqueios que sempre disparam, independente do</w:t>
-      </w:r>
-      <w:r>
-        <w:t xml:space="preserve"> </w:t>
-      </w:r>
-      <w:r>
-        <w:t xml:space="preserve">“bom senso”</w:t>
-      </w:r>
-      <w:r>
-        <w:t xml:space="preserve"> </w:t>
-      </w:r>
-      <w:r>
-        <w:t xml:space="preserve">do modelo.</w:t>
-      </w:r>
-    </w:p>
-    <w:p>
-      <w:pPr>
-        <w:pStyle w:val="Compact"/>
-        <w:numPr>
-          <w:ilvl w:val="1"/>
-          <w:numId w:val="1008"/>
-        </w:numPr>
-      </w:pPr>
+        <w:t xml:space="preserve">de agente: validações e bloqueios (</w:t>
+      </w:r>
       <w:r>
         <w:rPr>
           <w:i/>
           <w:iCs/>
         </w:rPr>
+        <w:t xml:space="preserve">guardrails</w:t>
+      </w:r>
+      <w:r>
+        <w:t xml:space="preserve">) que sempre disparam antes ou depois da execução do modelo, independente do</w:t>
+      </w:r>
+      <w:r>
+        <w:t xml:space="preserve"> </w:t>
+      </w:r>
+      <w:r>
+        <w:t xml:space="preserve">“bom senso”</w:t>
+      </w:r>
+      <w:r>
+        <w:t xml:space="preserve"> </w:t>
+      </w:r>
+      <w:r>
+        <w:t xml:space="preserve">do modelo — a mesma lógica dos</w:t>
+      </w:r>
+      <w:r>
+        <w:t xml:space="preserve"> </w:t>
+      </w:r>
+      <w:r>
+        <w:rPr>
+          <w:i/>
+          <w:iCs/>
+        </w:rPr>
+        <w:t xml:space="preserve">git hooks</w:t>
+      </w:r>
+      <w:r>
+        <w:t xml:space="preserve">, usada aqui apenas como analogia conceitual para intuir o mecanismo, sem exigir conhecimento prévio de Git.</w:t>
+      </w:r>
+    </w:p>
+    <w:p>
+      <w:pPr>
+        <w:pStyle w:val="Compact"/>
+        <w:numPr>
+          <w:ilvl w:val="1"/>
+          <w:numId w:val="1011"/>
+        </w:numPr>
+      </w:pPr>
+      <w:r>
+        <w:rPr>
+          <w:i/>
+          <w:iCs/>
+        </w:rPr>
         <w:t xml:space="preserve">Code as policy</w:t>
       </w:r>
       <w:r>
-        <w:t xml:space="preserve">: regras de governança escritas como código executável, não como texto que o modelo pode ou não seguir.</w:t>
+        <w:t xml:space="preserve">: checagem de integridade de dados, validação de formato e auditoria de commits como regras executáveis, não como pedido em prosa — apresentado via demonstração ao vivo pelos ministrantes, não como exercício prático dos participantes.</w:t>
       </w:r>
     </w:p>
     <w:p>
@@ -742,7 +858,7 @@
         <w:pStyle w:val="Compact"/>
         <w:numPr>
           <w:ilvl w:val="0"/>
-          <w:numId w:val="1007"/>
+          <w:numId w:val="1009"/>
         </w:numPr>
       </w:pPr>
       <w:r>
@@ -750,7 +866,7 @@
           <w:b/>
           <w:bCs/>
         </w:rPr>
-        <w:t xml:space="preserve">Skills e Model Context Protocol (MCP)</w:t>
+        <w:t xml:space="preserve">MCP, Linha de Comando e Segurança</w:t>
       </w:r>
     </w:p>
     <w:p>
@@ -758,53 +874,45 @@
         <w:pStyle w:val="Compact"/>
         <w:numPr>
           <w:ilvl w:val="1"/>
+          <w:numId w:val="1012"/>
+        </w:numPr>
+      </w:pPr>
+      <w:r>
+        <w:t xml:space="preserve">Model Context Protocol (MCP): como conectar agentes a bases de dados locais, APIs (inclusive governamentais) e ferramentas de busca de forma padronizada.</w:t>
+      </w:r>
+    </w:p>
+    <w:p>
+      <w:pPr>
+        <w:pStyle w:val="Compact"/>
+        <w:numPr>
+          <w:ilvl w:val="1"/>
+          <w:numId w:val="1012"/>
+        </w:numPr>
+      </w:pPr>
+      <w:r>
+        <w:t xml:space="preserve">Boas práticas de segurança: isolamento de chaves de API e permissões de execução — por que</w:t>
+      </w:r>
+      <w:r>
+        <w:t xml:space="preserve"> </w:t>
+      </w:r>
+      <w:r>
+        <w:t xml:space="preserve">“menos acesso”</w:t>
+      </w:r>
+      <w:r>
+        <w:t xml:space="preserve"> </w:t>
+      </w:r>
+      <w:r>
+        <w:t xml:space="preserve">é o padrão seguro.</w:t>
+      </w:r>
+    </w:p>
+    <w:p>
+      <w:pPr>
+        <w:pStyle w:val="Compact"/>
+        <w:numPr>
+          <w:ilvl w:val="0"/>
           <w:numId w:val="1009"/>
         </w:numPr>
       </w:pPr>
-      <w:r>
-        <w:t xml:space="preserve">O que são</w:t>
-      </w:r>
-      <w:r>
-        <w:t xml:space="preserve"> </w:t>
-      </w:r>
-      <w:r>
-        <w:rPr>
-          <w:i/>
-          <w:iCs/>
-        </w:rPr>
-        <w:t xml:space="preserve">skills</w:t>
-      </w:r>
-      <w:r>
-        <w:t xml:space="preserve">: instruções empacotadas e reutilizáveis para tarefas de pesquisa recorrentes.</w:t>
-      </w:r>
-    </w:p>
-    <w:p>
-      <w:pPr>
-        <w:pStyle w:val="Compact"/>
-        <w:numPr>
-          <w:ilvl w:val="1"/>
-          <w:numId w:val="1009"/>
-        </w:numPr>
-      </w:pPr>
-      <w:r>
-        <w:t xml:space="preserve">MCP: como conectar agentes a ferramentas externas (arquivos, bancos de dados, APIs) de forma padronizada.</w:t>
-      </w:r>
-    </w:p>
-    <w:p>
-      <w:pPr>
-        <w:pStyle w:val="Compact"/>
-        <w:numPr>
-          <w:ilvl w:val="0"/>
-          <w:numId w:val="1007"/>
-        </w:numPr>
-      </w:pPr>
-      <w:r>
-        <w:rPr>
-          <w:b/>
-          <w:bCs/>
-        </w:rPr>
-        <w:t xml:space="preserve">Escrevendo Bons Arquivos de Instrução (</w:t>
-      </w:r>
       <w:r>
         <w:rPr>
           <w:rStyle w:val="VerbatimChar"/>
@@ -818,47 +926,14 @@
           <w:b/>
           <w:bCs/>
         </w:rPr>
-        <w:t xml:space="preserve">)</w:t>
-      </w:r>
-    </w:p>
-    <w:p>
-      <w:pPr>
-        <w:pStyle w:val="Compact"/>
-        <w:numPr>
-          <w:ilvl w:val="1"/>
-          <w:numId w:val="1010"/>
-        </w:numPr>
-      </w:pPr>
-      <w:r>
-        <w:t xml:space="preserve">Estrutura, nível de detalhe e armadilhas comuns ao instruir um agente sobre como operar em um repositório ou projeto de pesquisa.</w:t>
-      </w:r>
-    </w:p>
-    <w:p>
-      <w:pPr>
-        <w:pStyle w:val="Compact"/>
-        <w:numPr>
-          <w:ilvl w:val="1"/>
-          <w:numId w:val="1010"/>
-        </w:numPr>
-      </w:pPr>
-      <w:r>
-        <w:t xml:space="preserve">Exemplos de boas e más práticas.</w:t>
-      </w:r>
-    </w:p>
-    <w:p>
-      <w:pPr>
-        <w:pStyle w:val="Compact"/>
-        <w:numPr>
-          <w:ilvl w:val="0"/>
-          <w:numId w:val="1007"/>
-        </w:numPr>
-      </w:pPr>
+        <w:t xml:space="preserve"> </w:t>
+      </w:r>
       <w:r>
         <w:rPr>
           <w:b/>
           <w:bCs/>
         </w:rPr>
-        <w:t xml:space="preserve">Software com IA para Pesquisa — Boas Aplicações Exemplares</w:t>
+        <w:t xml:space="preserve">e Reprodutibilidade</w:t>
       </w:r>
     </w:p>
     <w:p>
@@ -866,7 +941,47 @@
         <w:pStyle w:val="Compact"/>
         <w:numPr>
           <w:ilvl w:val="1"/>
-          <w:numId w:val="1011"/>
+          <w:numId w:val="1013"/>
+        </w:numPr>
+      </w:pPr>
+      <w:r>
+        <w:t xml:space="preserve">Estrutura, nível de detalhe e armadilhas comuns ao instruir um agente sobre como operar em um repositório ou projeto de pesquisa.</w:t>
+      </w:r>
+    </w:p>
+    <w:p>
+      <w:pPr>
+        <w:pStyle w:val="Compact"/>
+        <w:numPr>
+          <w:ilvl w:val="1"/>
+          <w:numId w:val="1013"/>
+        </w:numPr>
+      </w:pPr>
+      <w:r>
+        <w:t xml:space="preserve">Rastreabilidade: logs de execução e padrões de versionamento que permitem revisar o trabalho do agente depois.</w:t>
+      </w:r>
+    </w:p>
+    <w:p>
+      <w:pPr>
+        <w:pStyle w:val="Compact"/>
+        <w:numPr>
+          <w:ilvl w:val="0"/>
+          <w:numId w:val="1009"/>
+        </w:numPr>
+      </w:pPr>
+      <w:r>
+        <w:rPr>
+          <w:b/>
+          <w:bCs/>
+        </w:rPr>
+        <w:t xml:space="preserve">Software com IA para Pesquisa — Aplicações Exemplares</w:t>
+      </w:r>
+    </w:p>
+    <w:p>
+      <w:pPr>
+        <w:pStyle w:val="Compact"/>
+        <w:numPr>
+          <w:ilvl w:val="1"/>
+          <w:numId w:val="1014"/>
         </w:numPr>
       </w:pPr>
       <w:r>
@@ -878,11 +993,11 @@
         <w:pStyle w:val="Compact"/>
         <w:numPr>
           <w:ilvl w:val="1"/>
-          <w:numId w:val="1011"/>
-        </w:numPr>
-      </w:pPr>
-      <w:r>
-        <w:t xml:space="preserve">Categorias com boas alternativas de IA hoje (gestão de referências, transcrição, análise qualitativa): o mercado muda rápido e produtos específicos são superados por concorrentes ou novas versões — por isso o foco é no critério de avaliação, não em uma marca.</w:t>
+          <w:numId w:val="1014"/>
+        </w:numPr>
+      </w:pPr>
+      <w:r>
+        <w:t xml:space="preserve">Categorias com boas alternativas de IA hoje: gestão de referências (Zotero + Beaver), transcrição de áudio, análise de dados, etc.</w:t>
       </w:r>
     </w:p>
     <w:p>
@@ -890,11 +1005,11 @@
         <w:pStyle w:val="Compact"/>
         <w:numPr>
           <w:ilvl w:val="1"/>
-          <w:numId w:val="1011"/>
-        </w:numPr>
-      </w:pPr>
-      <w:r>
-        <w:t xml:space="preserve">Critérios para avaliar uma ferramenta antes de adotar: rastreabilidade da citação, portabilidade dos dados, custo e maturidade do projeto.</w:t>
+          <w:numId w:val="1014"/>
+        </w:numPr>
+      </w:pPr>
+      <w:r>
+        <w:t xml:space="preserve">Gerenciamento de contexto como boa prática recorrente nessas aplicações: por que separar o agente que executa do agente que audita o resultado reduz viés de confirmação e mantém cada etapa com um contexto mais enxuto e específico.</w:t>
       </w:r>
     </w:p>
     <w:bookmarkEnd w:id="13"/>
@@ -1273,6 +1388,12 @@
     <w:abstractNumId w:val="991"/>
   </w:num>
   <w:num w:numId="1007">
+    <w:abstractNumId w:val="991"/>
+  </w:num>
+  <w:num w:numId="1008">
+    <w:abstractNumId w:val="991"/>
+  </w:num>
+  <w:num w:numId="1009">
     <w:abstractNumId w:val="99411"/>
     <w:lvlOverride w:ilvl="0">
       <w:startOverride w:val="1"/>
@@ -1302,16 +1423,19 @@
       <w:startOverride w:val="1"/>
     </w:lvlOverride>
   </w:num>
-  <w:num w:numId="1008">
-    <w:abstractNumId w:val="991"/>
-  </w:num>
-  <w:num w:numId="1009">
-    <w:abstractNumId w:val="991"/>
-  </w:num>
   <w:num w:numId="1010">
     <w:abstractNumId w:val="991"/>
   </w:num>
   <w:num w:numId="1011">
+    <w:abstractNumId w:val="991"/>
+  </w:num>
+  <w:num w:numId="1012">
+    <w:abstractNumId w:val="991"/>
+  </w:num>
+  <w:num w:numId="1013">
+    <w:abstractNumId w:val="991"/>
+  </w:num>
+  <w:num w:numId="1014">
     <w:abstractNumId w:val="991"/>
   </w:num>
 </w:numbering>

</xml_diff>